<commit_message>
Expand scenario descriptions with full research context
</commit_message>
<xml_diff>
--- a/AG983_Assignment_2026.docx
+++ b/AG983_Assignment_2026.docx
@@ -1199,7 +1199,7 @@
           <w:b w:val="0"/>
           <w:i w:val="0"/>
         </w:rPr>
-        <w:t>Students examine how firms have disclosed cybersecurity risk across sectors between 2019 and 2024, assessing whether the SEC's December 2023 mandatory cyber disclosure rules produced measurable shifts in disclosure sentiment or thematic content. Anchor events include the SolarWinds breach (2020), Colonial Pipeline attack (2021), MOVEit data theft (2023), and the SEC's new Item 1.05 requirement (Form 8-K).</w:t>
+        <w:t>The onus on US public companies to disclose cybersecurity risk has grown sharply since 2019, driven by a series of high-profile breaches and a landmark regulatory intervention. In December 2020, attackers compromised SolarWinds' software update mechanism, embedding malicious code into products used by thousands of organisations including US federal agencies — the breach went undetected for months and reshaped how firms think about supply chain cyber risk. In May 2021, a ransomware attack on Colonial Pipeline, the largest US fuel pipeline operator, forced a shutdown that caused fuel shortages across the eastern United States and demonstrated the real-world consequences of cyber vulnerabilities in critical infrastructure. In 2023, a SQL injection attack exploiting MOVEit file-transfer software compromised data at hundreds of organisations including healthcare firms, financial institutions, and government agencies. Against this backdrop, the SEC adopted mandatory cybersecurity disclosure rules in December 2023, requiring companies to report material incidents within four business days (Form 8-K, Item 1.05) and to describe their cybersecurity risk management programme in annual reports (Form 10-K, Item 1C). This scenario asks: did these events and the new regulatory framework produce measurable shifts in how firms across sectors disclose cybersecurity risk? Does disclosure sentiment become more negative following a breach? Did the 2023 rules produce a step-change in disclosure depth, thematic content, or language complexity? The corpus spans financial services, healthcare, technology, and retail and hospitality — sectors with notably different breach profiles and regulatory exposures — allowing cross-sector comparisons as well as temporal analysis.</w:t>
       </w:r>
     </w:p>
     <w:p>
@@ -1253,7 +1253,7 @@
           <w:b w:val="0"/>
           <w:i w:val="0"/>
         </w:rPr>
-        <w:t>Students investigate how consumer-facing firms have disclosed sustainability commitments and associated risks between 2019 and 2024, examining whether disclosure language shifted in response to greenwashing litigation, SEC ESG disclosure proposals (2022), and FTC Green Guides scrutiny. The scenario tests whether textual signals distinguish firms facing legal challenge from those that are not.</w:t>
+        <w:t>Environmental, Social, and Governance (ESG) investing grew rapidly between 2019 and 2021, with consumer-facing companies making increasingly ambitious public commitments on climate, packaging, deforestation, and supply chain ethics to satisfy investor and consumer demand. By 2021-2022, however, the legal and regulatory environment began to push back. Greenwashing — the practice of making misleading or unsubstantiated environmental claims — attracted growing scrutiny from regulators and litigants. In March 2022 the SEC proposed mandatory climate-related disclosure rules for public companies, signalling that ESG claims would face the same rigour as financial statements. The Federal Trade Commission simultaneously reopened its Green Guides — the framework governing environmental marketing claims — for review, raising the prospect of enforcement action against companies whose sustainability language could not be substantiated. A wave of greenwashing lawsuits followed, targeting clothing retailers, food and beverage companies, and consumer goods manufacturers for claims about recycled content, carbon neutrality, and biodegradable packaging. This scenario asks: how did consumer-facing firms' ESG disclosure language evolve as the regulatory and litigation environment tightened? Did sentiment in sustainability-related disclosures become more cautious or hedged after 2021? Did firms facing legal challenge show different textual patterns from those that did not? The corpus spans consumer staples, apparel, food and beverage, and retail — sectors at the forefront of both ESG commitments and greenwashing scrutiny — and the six-year window captures both the peak of ESG enthusiasm and the subsequent correction.</w:t>
       </w:r>
     </w:p>
     <w:p>
@@ -1307,7 +1307,7 @@
           <w:b w:val="0"/>
           <w:i w:val="0"/>
         </w:rPr>
-        <w:t>Students analyse how firms directly named in opioid litigation, wholesale distributors, and pharmacy chains disclosed liability risk between 2015 and 2024, spanning the full litigation arc: early lawsuits (2017–2018), DOJ investigations, and multi-billion dollar state and federal settlements (2021–2022). The ten-year window enables longitudinal analysis of disclosure evolution before, during, and after peak legal exposure.</w:t>
+        <w:t>The United States opioid epidemic is one of the most consequential public health crises in modern history, responsible for over 500,000 overdose deaths between 1999 and 2019. Prescription opioids — painkillers including OxyContin, Vicodin, and fentanyl — were aggressively marketed by pharmaceutical manufacturers and widely dispensed through a distribution chain comprising wholesale distributors and pharmacy chains, many of which are publicly listed companies. Litigation against these firms began in earnest around 2017-2018, when state attorneys general and thousands of local governments filed suit alleging that manufacturers had misrepresented addiction risk, that distributors had failed to flag suspicious ordering patterns, and that pharmacy chains had dispensed pills without adequate oversight. The litigation arc that followed was extraordinary in scale: in 2021 the three major distributors — McKesson, AmerisourceBergen, and Cardinal Health — along with Johnson and Johnson agreed to pay a combined $26 billion to settle claims. CVS and Walgreens subsequently agreed to pay over $10 billion. Mallinckrodt and Endo International, two manufacturers facing the largest exposure, filed for bankruptcy. This scenario spans 2015 to 2024, capturing disclosures from before the litigation wave through its peak and into the post-settlement period. The corpus includes firms directly named as defendants alongside large pharmaceutical peers who were not named, enabling comparison of how liability exposure shaped disclosure language differently across firm types. Key questions include: did defendant firms show more negative sentiment or greater linguistic complexity in the years approaching settlement? How did the language of distributors differ from that of manufacturers? Did disclosure language change after settlements were reached?</w:t>
       </w:r>
     </w:p>
     <w:p>
@@ -1361,7 +1361,7 @@
           <w:b w:val="0"/>
           <w:i w:val="0"/>
         </w:rPr>
-        <w:t>Students examine how REITs and commercial real estate firms disclosed interest rate risk and refinancing exposure between 2018 and 2024, assessing whether pre-hike filings (2018–2021) differed systematically from those filed during and after the Federal Reserve's 2022–2023 rate hike cycle (0.25% to 5.50%). Office REITs facing concurrent WFH pressure provide a particularly rich sub-group for analysis.</w:t>
+        <w:t>Real Estate Investment Trusts (REITs) are companies that own, operate, or finance income-producing real estate and are required by law to distribute at least 90% of taxable income to shareholders. Their valuations are highly sensitive to interest rates: when rates rise, the cost of borrowing increases, property valuations fall (as cap rates reprice), and refinancing existing debt becomes more expensive — all of which must be disclosed to investors. This scenario covers a period of extraordinary interest rate volatility. From 2018 to 2021 the Federal Reserve held rates near zero, creating a low-cost financing environment in which REIT valuations expanded and debt was cheap. The COVID-19 pandemic in 2020 disrupted the sector unevenly: office occupancy collapsed as remote working became entrenched, retail REITs faced existential pressure as shops closed, while industrial REITs (warehouses and logistics facilities) boomed on the back of e-commerce growth. From March 2022 to July 2023, the Federal Reserve raised the federal funds rate from 0.25% to 5.50% — the fastest tightening cycle since the 1980s — in response to surging inflation. This repriced commercial real estate sharply: cap rates rose, asset values fell, and firms with near-term debt maturities faced refinancing at dramatically higher costs. Office REITs suffered a particularly acute double pressure: falling occupancy from hybrid working and falling valuations from rising rates simultaneously. This scenario asks whether the textual signals in REIT filings shifted measurably between the low-rate expansion (2018–2021) and the high-rate contraction (2022–2024). Did sentiment become more negative? Did complexity rise as firms hedged their language around uncertain refinancing outcomes? Did year-on-year cosine similarity fall as the language of risk changed rapidly? The corpus spans office, industrial, retail, and residential REITs alongside commercial real estate services firms, providing a rich basis for cross-category as well as temporal comparison.</w:t>
       </w:r>
     </w:p>
     <w:p>

</xml_diff>